<commit_message>
Score v1.0: citações revistas (Civiletti: 32 pares, 12 significativos; Cakici 2016 e Bessembinder 2023 para o Brasil; páginas de Civiletti e Bortoluzzo). 4º lote de artigos conferido
Co-Authored-By: Claude Opus 5.5 <noreply@anthropic.com>
Claude-Session: https://claude.ai/code/session_01HefRF4fGJRzRQKWSK6E8Hc
</commit_message>
<xml_diff>
--- a/docs/Score_Exponencial_metodologia_v1.0.docx
+++ b/docs/Score_Exponencial_metodologia_v1.0.docx
@@ -90,7 +90,7 @@
           <w:sz w:val="24"/>
           <w:szCs w:val="24"/>
         </w:rPr>
-        <w:t xml:space="preserve">Versão 1.0 — aprovada em 22 de outubro de 2026</w:t>
+        <w:t xml:space="preserve">Versão 1.0 — aprovada em 22 de outubro de 2026 (citações revistas)</w:t>
       </w:r>
     </w:p>
     <w:p>
@@ -422,10 +422,31 @@
           <w:b/>
           <w:bCs/>
         </w:rPr>
-        <w:t xml:space="preserve">No Brasil há evidência de momentum e de qualidade:</w:t>
-      </w:r>
-      <w:r>
-        <w:t xml:space="preserve"> vencedores superaram perdedores em todas as 64 comparações de 2009 a 2018, com custos (Civiletti; Campani; Roquete, 2020); a qualidade é persistente (Bortoluzzo; Pistili; Bortoluzzo, 2021).</w:t>
+        <w:t xml:space="preserve">No Brasil, a evidência de momentum é fraca e a de qualidade é boa:</w:t>
+      </w:r>
+      <w:r>
+        <w:t xml:space="preserve"> em 2009-2018, as 32 carteiras de vencedoras superaram as de perdedoras, mas a diferença foi significativa só em 12 delas, a 10% (Civiletti; Campani; Roquete, 2020); em 1990-2013, o momentum não foi significativo (Cakici; Tang; Yan, 2016). Já a qualidade é persistente e rende mais ajustada ao risco (Bortoluzzo; Pistili; Bortoluzzo, 2021).</w:t>
+      </w:r>
+    </w:p>
+    <w:p>
+      <w:pPr>
+        <w:pStyle w:val="ListParagraph"/>
+        <w:numPr>
+          <w:ilvl w:val="0"/>
+          <w:numId w:val="3"/>
+        </w:numPr>
+        <w:spacing w:after="60" w:line="280"/>
+        <w:jc w:val="both"/>
+      </w:pPr>
+      <w:r>
+        <w:rPr>
+          <w:b/>
+          <w:bCs/>
+        </w:rPr>
+        <w:t xml:space="preserve">No Brasil, poucas empresas criam toda a riqueza:</w:t>
+      </w:r>
+      <w:r>
+        <w:t xml:space="preserve"> de 1993 a 2020, 20 das 390 empresas (5%) criaram 98% da riqueza líquida; e só 34,7% das ações superaram o próprio mercado (Bessembinder et al., 2023).</w:t>
       </w:r>
     </w:p>
     <w:p>
@@ -9071,23 +9092,23 @@
           <w:sz w:val="19"/>
           <w:szCs w:val="19"/>
         </w:rPr>
-        <w:t xml:space="preserve">BORTOLUZZO, A. B.; PISTILI, G. N.; BORTOLUZZO, M. M. Analyzing the quality factor for Brazil. </w:t>
-      </w:r>
-      <w:r>
-        <w:rPr>
-          <w:b/>
-          <w:bCs/>
-          <w:sz w:val="19"/>
-          <w:szCs w:val="19"/>
-        </w:rPr>
-        <w:t xml:space="preserve">Revista Brasileira de Finanças</w:t>
-      </w:r>
-      <w:r>
-        <w:rPr>
-          <w:sz w:val="19"/>
-          <w:szCs w:val="19"/>
-        </w:rPr>
-        <w:t xml:space="preserve">, v. 19, n. 3, 2021.</w:t>
+        <w:t xml:space="preserve">BESSEMBINDER, H.; CHEN, T.-F.; CHOI, G.; WEI, K. C. J. Long-term shareholder returns: evidence from 64,000 global stocks. </w:t>
+      </w:r>
+      <w:r>
+        <w:rPr>
+          <w:b/>
+          <w:bCs/>
+          <w:sz w:val="19"/>
+          <w:szCs w:val="19"/>
+        </w:rPr>
+        <w:t xml:space="preserve">Financial Analysts Journal</w:t>
+      </w:r>
+      <w:r>
+        <w:rPr>
+          <w:sz w:val="19"/>
+          <w:szCs w:val="19"/>
+        </w:rPr>
+        <w:t xml:space="preserve">, v. 79, n. 3, p. 33-63, 2023.</w:t>
       </w:r>
     </w:p>
     <w:p>
@@ -9101,23 +9122,23 @@
           <w:sz w:val="19"/>
           <w:szCs w:val="19"/>
         </w:rPr>
-        <w:t xml:space="preserve">BROCK, W.; LAKONISHOK, J.; LEBARON, B. Simple technical trading rules and the stochastic properties of stock returns. </w:t>
-      </w:r>
-      <w:r>
-        <w:rPr>
-          <w:b/>
-          <w:bCs/>
-          <w:sz w:val="19"/>
-          <w:szCs w:val="19"/>
-        </w:rPr>
-        <w:t xml:space="preserve">The Journal of Finance</w:t>
-      </w:r>
-      <w:r>
-        <w:rPr>
-          <w:sz w:val="19"/>
-          <w:szCs w:val="19"/>
-        </w:rPr>
-        <w:t xml:space="preserve">, v. 47, n. 5, p. 1731-1764, 1992.</w:t>
+        <w:t xml:space="preserve">BORTOLUZZO, A. B.; PISTILI, G. N.; BORTOLUZZO, M. M. Analyzing the quality factor for Brazil. </w:t>
+      </w:r>
+      <w:r>
+        <w:rPr>
+          <w:b/>
+          <w:bCs/>
+          <w:sz w:val="19"/>
+          <w:szCs w:val="19"/>
+        </w:rPr>
+        <w:t xml:space="preserve">Revista Brasileira de Finanças</w:t>
+      </w:r>
+      <w:r>
+        <w:rPr>
+          <w:sz w:val="19"/>
+          <w:szCs w:val="19"/>
+        </w:rPr>
+        <w:t xml:space="preserve">, v. 19, n. 3, p. 31-52, 2021.</w:t>
       </w:r>
     </w:p>
     <w:p>
@@ -9131,7 +9152,7 @@
           <w:sz w:val="19"/>
           <w:szCs w:val="19"/>
         </w:rPr>
-        <w:t xml:space="preserve">CAMPBELL, J. Y.; HILSCHER, J.; SZILAGYI, J. In search of distress risk. </w:t>
+        <w:t xml:space="preserve">BROCK, W.; LAKONISHOK, J.; LEBARON, B. Simple technical trading rules and the stochastic properties of stock returns. </w:t>
       </w:r>
       <w:r>
         <w:rPr>
@@ -9147,7 +9168,7 @@
           <w:sz w:val="19"/>
           <w:szCs w:val="19"/>
         </w:rPr>
-        <w:t xml:space="preserve">, v. 63, n. 6, p. 2899-2939, 2008.</w:t>
+        <w:t xml:space="preserve">, v. 47, n. 5, p. 1731-1764, 1992.</w:t>
       </w:r>
     </w:p>
     <w:p>
@@ -9161,23 +9182,23 @@
           <w:sz w:val="19"/>
           <w:szCs w:val="19"/>
         </w:rPr>
-        <w:t xml:space="preserve">CARHART, M. M. On persistence in mutual fund performance. </w:t>
-      </w:r>
-      <w:r>
-        <w:rPr>
-          <w:b/>
-          <w:bCs/>
-          <w:sz w:val="19"/>
-          <w:szCs w:val="19"/>
-        </w:rPr>
-        <w:t xml:space="preserve">The Journal of Finance</w:t>
-      </w:r>
-      <w:r>
-        <w:rPr>
-          <w:sz w:val="19"/>
-          <w:szCs w:val="19"/>
-        </w:rPr>
-        <w:t xml:space="preserve">, v. 52, n. 1, p. 57-82, 1997.</w:t>
+        <w:t xml:space="preserve">CAKICI, N.; TANG, Y.; YAN, A. Do the size, value, and momentum factors drive stock returns in emerging markets? </w:t>
+      </w:r>
+      <w:r>
+        <w:rPr>
+          <w:b/>
+          <w:bCs/>
+          <w:sz w:val="19"/>
+          <w:szCs w:val="19"/>
+        </w:rPr>
+        <w:t xml:space="preserve">Journal of International Money and Finance</w:t>
+      </w:r>
+      <w:r>
+        <w:rPr>
+          <w:sz w:val="19"/>
+          <w:szCs w:val="19"/>
+        </w:rPr>
+        <w:t xml:space="preserve">, v. 69, p. 179-204, 2016.</w:t>
       </w:r>
     </w:p>
     <w:p>
@@ -9191,7 +9212,7 @@
           <w:sz w:val="19"/>
           <w:szCs w:val="19"/>
         </w:rPr>
-        <w:t xml:space="preserve">CHAN, L. K. C.; JEGADEESH, N.; LAKONISHOK, J. Momentum strategies. </w:t>
+        <w:t xml:space="preserve">CAMPBELL, J. Y.; HILSCHER, J.; SZILAGYI, J. In search of distress risk. </w:t>
       </w:r>
       <w:r>
         <w:rPr>
@@ -9207,7 +9228,7 @@
           <w:sz w:val="19"/>
           <w:szCs w:val="19"/>
         </w:rPr>
-        <w:t xml:space="preserve">, v. 51, n. 5, p. 1681-1713, 1996.</w:t>
+        <w:t xml:space="preserve">, v. 63, n. 6, p. 2899-2939, 2008.</w:t>
       </w:r>
     </w:p>
     <w:p>
@@ -9221,7 +9242,7 @@
           <w:sz w:val="19"/>
           <w:szCs w:val="19"/>
         </w:rPr>
-        <w:t xml:space="preserve">CHAN, L. K. C.; KARCESKI, J.; LAKONISHOK, J. The level and persistence of growth rates. </w:t>
+        <w:t xml:space="preserve">CARHART, M. M. On persistence in mutual fund performance. </w:t>
       </w:r>
       <w:r>
         <w:rPr>
@@ -9237,7 +9258,7 @@
           <w:sz w:val="19"/>
           <w:szCs w:val="19"/>
         </w:rPr>
-        <w:t xml:space="preserve">, v. 58, n. 2, p. 643-684, 2003.</w:t>
+        <w:t xml:space="preserve">, v. 52, n. 1, p. 57-82, 1997.</w:t>
       </w:r>
     </w:p>
     <w:p>
@@ -9251,6 +9272,66 @@
           <w:sz w:val="19"/>
           <w:szCs w:val="19"/>
         </w:rPr>
+        <w:t xml:space="preserve">CHAN, L. K. C.; JEGADEESH, N.; LAKONISHOK, J. Momentum strategies. </w:t>
+      </w:r>
+      <w:r>
+        <w:rPr>
+          <w:b/>
+          <w:bCs/>
+          <w:sz w:val="19"/>
+          <w:szCs w:val="19"/>
+        </w:rPr>
+        <w:t xml:space="preserve">The Journal of Finance</w:t>
+      </w:r>
+      <w:r>
+        <w:rPr>
+          <w:sz w:val="19"/>
+          <w:szCs w:val="19"/>
+        </w:rPr>
+        <w:t xml:space="preserve">, v. 51, n. 5, p. 1681-1713, 1996.</w:t>
+      </w:r>
+    </w:p>
+    <w:p>
+      <w:pPr>
+        <w:spacing w:after="60" w:line="250"/>
+        <w:ind w:left="360" w:hanging="360"/>
+        <w:jc w:val="both"/>
+      </w:pPr>
+      <w:r>
+        <w:rPr>
+          <w:sz w:val="19"/>
+          <w:szCs w:val="19"/>
+        </w:rPr>
+        <w:t xml:space="preserve">CHAN, L. K. C.; KARCESKI, J.; LAKONISHOK, J. The level and persistence of growth rates. </w:t>
+      </w:r>
+      <w:r>
+        <w:rPr>
+          <w:b/>
+          <w:bCs/>
+          <w:sz w:val="19"/>
+          <w:szCs w:val="19"/>
+        </w:rPr>
+        <w:t xml:space="preserve">The Journal of Finance</w:t>
+      </w:r>
+      <w:r>
+        <w:rPr>
+          <w:sz w:val="19"/>
+          <w:szCs w:val="19"/>
+        </w:rPr>
+        <w:t xml:space="preserve">, v. 58, n. 2, p. 643-684, 2003.</w:t>
+      </w:r>
+    </w:p>
+    <w:p>
+      <w:pPr>
+        <w:spacing w:after="60" w:line="250"/>
+        <w:ind w:left="360" w:hanging="360"/>
+        <w:jc w:val="both"/>
+      </w:pPr>
+      <w:r>
+        <w:rPr>
+          <w:sz w:val="19"/>
+          <w:szCs w:val="19"/>
+        </w:rPr>
         <w:t xml:space="preserve">CIVILETTI, F.; CAMPANI, C. H.; ROQUETE, R. Carteiras igualmente ponderadas e "efeito momentum": uma combinação interessante para investidores não sofisticados? </w:t>
       </w:r>
       <w:r>
@@ -9267,7 +9348,7 @@
           <w:sz w:val="19"/>
           <w:szCs w:val="19"/>
         </w:rPr>
-        <w:t xml:space="preserve">, v. 17, n. 5, p. 507-522, 2020.</w:t>
+        <w:t xml:space="preserve">, v. 17, n. 5, p. 506-522, 2020.</w:t>
       </w:r>
     </w:p>
     <w:p>

</xml_diff>